<commit_message>
Story,Pragrapha,Run,Text - have now direct access to Wordprocessing document
</commit_message>
<xml_diff>
--- a/Samples/Colors test updated.docx
+++ b/Samples/Colors test updated.docx
@@ -16,9 +16,9 @@
       </w:r>
       <w:r>
         <w:rPr>
-          <w:color w:val="0000FF"/>
+          <w:color w:val="FF0000"/>
         </w:rPr>
-        <w:t>BLUE</w:t>
+        <w:t>RED</w:t>
       </w:r>
       <w:r>
         <w:t>.</w:t>
@@ -38,9 +38,9 @@
       </w:r>
       <w:r>
         <w:rPr>
-          <w:color w:themeColor="accent2"/>
+          <w:color w:val="4472C4" w:themeColor="accent1"/>
         </w:rPr>
-        <w:t>ACCENT2</w:t>
+        <w:t>ACCENT1</w:t>
       </w:r>
       <w:r>
         <w:t>.</w:t>

</xml_diff>

<commit_message>
Paragraph Properties read OK
</commit_message>
<xml_diff>
--- a/Samples/Colors test updated.docx
+++ b/Samples/Colors test updated.docx
@@ -89,7 +89,7 @@
         <w:rPr>
           <w:color w:val="0000FF"/>
         </w:rPr>
-        <w:t>BLUE</w:t>
+        <w:t>RED</w:t>
       </w:r>
       <w:r>
         <w:t>.</w:t>
@@ -111,7 +111,7 @@
         <w:rPr>
           <w:color w:themeColor="accent2"/>
         </w:rPr>
-        <w:t>ACCENT2</w:t>
+        <w:t>ACCENT1</w:t>
       </w:r>
       <w:r>
         <w:t>.</w:t>

</xml_diff>

<commit_message>
DeepEqual lack in ModelElement repaired
</commit_message>
<xml_diff>
--- a/Samples/Colors test updated.docx
+++ b/Samples/Colors test updated.docx
@@ -87,9 +87,9 @@
       </w:r>
       <w:r>
         <w:rPr>
-          <w:color w:val="0000FF"/>
+          <w:color w:val="FF0000"/>
         </w:rPr>
-        <w:t>RED</w:t>
+        <w:t>BLUE</w:t>
       </w:r>
       <w:r>
         <w:t>.</w:t>
@@ -109,9 +109,9 @@
       </w:r>
       <w:r>
         <w:rPr>
-          <w:color w:themeColor="accent2"/>
+          <w:color w:val="4472C4" w:themeColor="accent1"/>
         </w:rPr>
-        <w:t>ACCENT1</w:t>
+        <w:t>ACCENT2</w:t>
       </w:r>
       <w:r>
         <w:t>.</w:t>

</xml_diff>